<commit_message>
Investigación de datasets y ampliación
</commit_message>
<xml_diff>
--- a/Semana3.docx
+++ b/Semana3.docx
@@ -418,17 +418,35 @@
       </w:r>
     </w:p>
     <w:p>
-      <w:r>
+      <w:pPr>
         <w:rPr>
           <w:b/>
           <w:bCs/>
         </w:rPr>
+      </w:pPr>
+    </w:p>
+    <w:p>
+      <w:pPr>
+        <w:rPr>
+          <w:b/>
+          <w:bCs/>
+        </w:rPr>
+      </w:pPr>
+    </w:p>
+    <w:p>
+      <w:bookmarkStart w:id="0" w:name="_GoBack"/>
+      <w:bookmarkEnd w:id="0"/>
+      <w:r>
+        <w:rPr>
+          <w:b/>
+          <w:bCs/>
+        </w:rPr>
+        <w:lastRenderedPageBreak/>
         <w:t>Viabilidad</w:t>
       </w:r>
     </w:p>
     <w:p>
       <w:r>
-        <w:lastRenderedPageBreak/>
         <w:t xml:space="preserve">El proyecto puede desarrollarse utilizando herramientas como Python, </w:t>
       </w:r>
       <w:proofErr w:type="spellStart"/>
@@ -490,9 +508,293 @@
       <w:r>
         <w:t>La primera versión se concentrará en normal y neumonía, manteniendo la posibilidad de ampliar el sistema posteriormente.</w:t>
       </w:r>
-      <w:bookmarkStart w:id="0" w:name="_GoBack"/>
-      <w:bookmarkEnd w:id="0"/>
-    </w:p>
+    </w:p>
+    <w:p>
+      <w:r>
+        <w:rPr>
+          <w:b/>
+          <w:bCs/>
+        </w:rPr>
+        <w:t>Investigación de conjuntos de datos</w:t>
+      </w:r>
+    </w:p>
+    <w:p>
+      <w:r>
+        <w:t>Como parte del avance del proyecto se realizó una investigación sobre diferentes conjuntos de datos públicos de radiografías de tórax que pueden utilizarse para desarrollar y evaluar modelos de Inteligencia Artificial.</w:t>
+      </w:r>
+    </w:p>
+    <w:p>
+      <w:r>
+        <w:t xml:space="preserve">Entre las opciones investigadas se encuentran conjuntos como </w:t>
+      </w:r>
+      <w:proofErr w:type="spellStart"/>
+      <w:r>
+        <w:t>Kermany</w:t>
+      </w:r>
+      <w:proofErr w:type="spellEnd"/>
+      <w:r>
+        <w:t>/</w:t>
+      </w:r>
+      <w:proofErr w:type="spellStart"/>
+      <w:r>
+        <w:t>Pediatric</w:t>
+      </w:r>
+      <w:proofErr w:type="spellEnd"/>
+      <w:r>
+        <w:t xml:space="preserve"> </w:t>
+      </w:r>
+      <w:proofErr w:type="spellStart"/>
+      <w:r>
+        <w:t>Chest</w:t>
+      </w:r>
+      <w:proofErr w:type="spellEnd"/>
+      <w:r>
+        <w:t xml:space="preserve"> X-</w:t>
+      </w:r>
+      <w:proofErr w:type="spellStart"/>
+      <w:r>
+        <w:t>Ray</w:t>
+      </w:r>
+      <w:proofErr w:type="spellEnd"/>
+      <w:r>
+        <w:t xml:space="preserve">, RSNA </w:t>
+      </w:r>
+      <w:proofErr w:type="spellStart"/>
+      <w:r>
+        <w:t>Pneumonia</w:t>
+      </w:r>
+      <w:proofErr w:type="spellEnd"/>
+      <w:r>
+        <w:t xml:space="preserve"> </w:t>
+      </w:r>
+      <w:proofErr w:type="spellStart"/>
+      <w:r>
+        <w:t>Detection</w:t>
+      </w:r>
+      <w:proofErr w:type="spellEnd"/>
+      <w:r>
+        <w:t xml:space="preserve">, NIH ChestX-ray14, </w:t>
+      </w:r>
+      <w:proofErr w:type="spellStart"/>
+      <w:r>
+        <w:t>CheXpert</w:t>
+      </w:r>
+      <w:proofErr w:type="spellEnd"/>
+      <w:r>
+        <w:t xml:space="preserve"> y MIMIC-CXR.</w:t>
+      </w:r>
+    </w:p>
+    <w:p>
+      <w:r>
+        <w:t xml:space="preserve">Después de comparar sus características, se identificó el conjunto de radiografías utilizado en el trabajo de </w:t>
+      </w:r>
+      <w:proofErr w:type="spellStart"/>
+      <w:r>
+        <w:t>Kermany</w:t>
+      </w:r>
+      <w:proofErr w:type="spellEnd"/>
+      <w:r>
+        <w:t xml:space="preserve"> y colaboradores como una opción especialmente interesante para el proyecto, debido a que contiene radiografías clasificadas como normales y con neumonía, además de contar con categorías de neumonía bacteriana y viral.</w:t>
+      </w:r>
+    </w:p>
+    <w:p>
+      <w:r>
+        <w:t>Esto abre la posibilidad de desarrollar el proyecto en dos niveles.</w:t>
+      </w:r>
+    </w:p>
+    <w:p>
+      <w:r>
+        <w:rPr>
+          <w:b/>
+          <w:bCs/>
+        </w:rPr>
+        <w:t>Primera etapa</w:t>
+      </w:r>
+    </w:p>
+    <w:p>
+      <w:r>
+        <w:t>La primera etapa será:</w:t>
+      </w:r>
+    </w:p>
+    <w:p>
+      <w:r>
+        <w:t>Radiografía → Normal / Neumonía</w:t>
+      </w:r>
+    </w:p>
+    <w:p>
+      <w:r>
+        <w:t>Esta será la funcionalidad principal que deberá estar implementada y funcionando.</w:t>
+      </w:r>
+    </w:p>
+    <w:p>
+      <w:r>
+        <w:rPr>
+          <w:b/>
+          <w:bCs/>
+        </w:rPr>
+        <w:t>Segunda etapa</w:t>
+      </w:r>
+    </w:p>
+    <w:p>
+      <w:r>
+        <w:t>Si la cantidad y calidad de los datos lo permiten, se experimentará con una clasificación más específica:</w:t>
+      </w:r>
+    </w:p>
+    <w:p>
+      <w:r>
+        <w:t>Neumonía → Bacteriana / Viral</w:t>
+      </w:r>
+    </w:p>
+    <w:p>
+      <w:r>
+        <w:t>Esta segunda clasificación será considerada como una ampliación del proyecto y solamente se implementará si los resultados obtenidos son suficientemente confiables.</w:t>
+      </w:r>
+    </w:p>
+    <w:p>
+      <w:r>
+        <w:t>No se incluirá inicialmente la clasificación de neumonía fúngica debido a que no se ha identificado un conjunto de datos público con las mismas características y cantidad suficiente para realizar esta clasificación de manera adecuada.</w:t>
+      </w:r>
+    </w:p>
+    <w:p>
+      <w:r>
+        <w:rPr>
+          <w:b/>
+          <w:bCs/>
+        </w:rPr>
+        <w:lastRenderedPageBreak/>
+        <w:t>Experimentación propuesta</w:t>
+      </w:r>
+    </w:p>
+    <w:p>
+      <w:r>
+        <w:t xml:space="preserve">Se realizarán diferentes experimentos para comparar el desempeño de los modelos. Inicialmente se desarrollará una CNN como modelo base y posteriormente se podrán probar diferentes configuraciones o técnicas de transfer </w:t>
+      </w:r>
+      <w:proofErr w:type="spellStart"/>
+      <w:r>
+        <w:t>learning</w:t>
+      </w:r>
+      <w:proofErr w:type="spellEnd"/>
+      <w:r>
+        <w:t>.</w:t>
+      </w:r>
+    </w:p>
+    <w:p>
+      <w:r>
+        <w:t>Los resultados serán comparados mediante:</w:t>
+      </w:r>
+    </w:p>
+    <w:p>
+      <w:pPr>
+        <w:numPr>
+          <w:ilvl w:val="0"/>
+          <w:numId w:val="4"/>
+        </w:numPr>
+      </w:pPr>
+      <w:proofErr w:type="spellStart"/>
+      <w:r>
+        <w:t>Accuracy</w:t>
+      </w:r>
+      <w:proofErr w:type="spellEnd"/>
+      <w:r>
+        <w:t>.</w:t>
+      </w:r>
+    </w:p>
+    <w:p>
+      <w:pPr>
+        <w:numPr>
+          <w:ilvl w:val="0"/>
+          <w:numId w:val="4"/>
+        </w:numPr>
+      </w:pPr>
+      <w:proofErr w:type="spellStart"/>
+      <w:r>
+        <w:t>Precision</w:t>
+      </w:r>
+      <w:proofErr w:type="spellEnd"/>
+      <w:r>
+        <w:t>.</w:t>
+      </w:r>
+    </w:p>
+    <w:p>
+      <w:pPr>
+        <w:numPr>
+          <w:ilvl w:val="0"/>
+          <w:numId w:val="4"/>
+        </w:numPr>
+      </w:pPr>
+      <w:proofErr w:type="spellStart"/>
+      <w:r>
+        <w:t>Recall</w:t>
+      </w:r>
+      <w:proofErr w:type="spellEnd"/>
+      <w:r>
+        <w:t>.</w:t>
+      </w:r>
+    </w:p>
+    <w:p>
+      <w:pPr>
+        <w:numPr>
+          <w:ilvl w:val="0"/>
+          <w:numId w:val="4"/>
+        </w:numPr>
+      </w:pPr>
+      <w:r>
+        <w:t>F1-score.</w:t>
+      </w:r>
+    </w:p>
+    <w:p>
+      <w:pPr>
+        <w:numPr>
+          <w:ilvl w:val="0"/>
+          <w:numId w:val="4"/>
+        </w:numPr>
+      </w:pPr>
+      <w:r>
+        <w:t>Matriz de confusión.</w:t>
+      </w:r>
+    </w:p>
+    <w:p>
+      <w:r>
+        <w:t xml:space="preserve">También se analizará la posibilidad de utilizar técnicas de </w:t>
+      </w:r>
+      <w:proofErr w:type="spellStart"/>
+      <w:r>
+        <w:t>explicabilidad</w:t>
+      </w:r>
+      <w:proofErr w:type="spellEnd"/>
+      <w:r>
+        <w:t xml:space="preserve"> como </w:t>
+      </w:r>
+      <w:proofErr w:type="spellStart"/>
+      <w:r>
+        <w:t>Grad</w:t>
+      </w:r>
+      <w:proofErr w:type="spellEnd"/>
+      <w:r>
+        <w:t>-CAM para visualizar las regiones de la radiografía que influyeron en la predicción del modelo.</w:t>
+      </w:r>
+    </w:p>
+    <w:p>
+      <w:r>
+        <w:rPr>
+          <w:b/>
+          <w:bCs/>
+        </w:rPr>
+        <w:t>Alcance futuro</w:t>
+      </w:r>
+    </w:p>
+    <w:p>
+      <w:r>
+        <w:t>Una vez desarrollada la clasificación principal, el sistema podrá ampliarse hacia diferentes categorías de neumonía y posteriormente hacia otras enfermedades respiratorias.</w:t>
+      </w:r>
+      <w:r>
+        <w:t xml:space="preserve"> </w:t>
+      </w:r>
+      <w:r>
+        <w:t>De esta manera, el proyecto mantiene un alcance viable para su desarrollo actual, pero cuenta con una arquitectura que permite su crecimiento.</w:t>
+      </w:r>
+    </w:p>
+    <w:p/>
     <w:p/>
     <w:p/>
     <w:p/>
@@ -928,6 +1230,155 @@
       </w:rPr>
     </w:lvl>
   </w:abstractNum>
+  <w:abstractNum w:abstractNumId="3" w15:restartNumberingAfterBreak="0">
+    <w:nsid w:val="79EF1DCA"/>
+    <w:multiLevelType w:val="multilevel"/>
+    <w:tmpl w:val="26DE997E"/>
+    <w:lvl w:ilvl="0">
+      <w:start w:val="1"/>
+      <w:numFmt w:val="bullet"/>
+      <w:lvlText w:val=""/>
+      <w:lvlJc w:val="left"/>
+      <w:pPr>
+        <w:tabs>
+          <w:tab w:val="num" w:pos="720"/>
+        </w:tabs>
+        <w:ind w:left="720" w:hanging="360"/>
+      </w:pPr>
+      <w:rPr>
+        <w:rFonts w:ascii="Symbol" w:hAnsi="Symbol" w:hint="default"/>
+        <w:sz w:val="20"/>
+      </w:rPr>
+    </w:lvl>
+    <w:lvl w:ilvl="1" w:tentative="1">
+      <w:start w:val="1"/>
+      <w:numFmt w:val="bullet"/>
+      <w:lvlText w:val="o"/>
+      <w:lvlJc w:val="left"/>
+      <w:pPr>
+        <w:tabs>
+          <w:tab w:val="num" w:pos="1440"/>
+        </w:tabs>
+        <w:ind w:left="1440" w:hanging="360"/>
+      </w:pPr>
+      <w:rPr>
+        <w:rFonts w:ascii="Courier New" w:hAnsi="Courier New" w:hint="default"/>
+        <w:sz w:val="20"/>
+      </w:rPr>
+    </w:lvl>
+    <w:lvl w:ilvl="2" w:tentative="1">
+      <w:start w:val="1"/>
+      <w:numFmt w:val="bullet"/>
+      <w:lvlText w:val=""/>
+      <w:lvlJc w:val="left"/>
+      <w:pPr>
+        <w:tabs>
+          <w:tab w:val="num" w:pos="2160"/>
+        </w:tabs>
+        <w:ind w:left="2160" w:hanging="360"/>
+      </w:pPr>
+      <w:rPr>
+        <w:rFonts w:ascii="Wingdings" w:hAnsi="Wingdings" w:hint="default"/>
+        <w:sz w:val="20"/>
+      </w:rPr>
+    </w:lvl>
+    <w:lvl w:ilvl="3" w:tentative="1">
+      <w:start w:val="1"/>
+      <w:numFmt w:val="bullet"/>
+      <w:lvlText w:val=""/>
+      <w:lvlJc w:val="left"/>
+      <w:pPr>
+        <w:tabs>
+          <w:tab w:val="num" w:pos="2880"/>
+        </w:tabs>
+        <w:ind w:left="2880" w:hanging="360"/>
+      </w:pPr>
+      <w:rPr>
+        <w:rFonts w:ascii="Wingdings" w:hAnsi="Wingdings" w:hint="default"/>
+        <w:sz w:val="20"/>
+      </w:rPr>
+    </w:lvl>
+    <w:lvl w:ilvl="4" w:tentative="1">
+      <w:start w:val="1"/>
+      <w:numFmt w:val="bullet"/>
+      <w:lvlText w:val=""/>
+      <w:lvlJc w:val="left"/>
+      <w:pPr>
+        <w:tabs>
+          <w:tab w:val="num" w:pos="3600"/>
+        </w:tabs>
+        <w:ind w:left="3600" w:hanging="360"/>
+      </w:pPr>
+      <w:rPr>
+        <w:rFonts w:ascii="Wingdings" w:hAnsi="Wingdings" w:hint="default"/>
+        <w:sz w:val="20"/>
+      </w:rPr>
+    </w:lvl>
+    <w:lvl w:ilvl="5" w:tentative="1">
+      <w:start w:val="1"/>
+      <w:numFmt w:val="bullet"/>
+      <w:lvlText w:val=""/>
+      <w:lvlJc w:val="left"/>
+      <w:pPr>
+        <w:tabs>
+          <w:tab w:val="num" w:pos="4320"/>
+        </w:tabs>
+        <w:ind w:left="4320" w:hanging="360"/>
+      </w:pPr>
+      <w:rPr>
+        <w:rFonts w:ascii="Wingdings" w:hAnsi="Wingdings" w:hint="default"/>
+        <w:sz w:val="20"/>
+      </w:rPr>
+    </w:lvl>
+    <w:lvl w:ilvl="6" w:tentative="1">
+      <w:start w:val="1"/>
+      <w:numFmt w:val="bullet"/>
+      <w:lvlText w:val=""/>
+      <w:lvlJc w:val="left"/>
+      <w:pPr>
+        <w:tabs>
+          <w:tab w:val="num" w:pos="5040"/>
+        </w:tabs>
+        <w:ind w:left="5040" w:hanging="360"/>
+      </w:pPr>
+      <w:rPr>
+        <w:rFonts w:ascii="Wingdings" w:hAnsi="Wingdings" w:hint="default"/>
+        <w:sz w:val="20"/>
+      </w:rPr>
+    </w:lvl>
+    <w:lvl w:ilvl="7" w:tentative="1">
+      <w:start w:val="1"/>
+      <w:numFmt w:val="bullet"/>
+      <w:lvlText w:val=""/>
+      <w:lvlJc w:val="left"/>
+      <w:pPr>
+        <w:tabs>
+          <w:tab w:val="num" w:pos="5760"/>
+        </w:tabs>
+        <w:ind w:left="5760" w:hanging="360"/>
+      </w:pPr>
+      <w:rPr>
+        <w:rFonts w:ascii="Wingdings" w:hAnsi="Wingdings" w:hint="default"/>
+        <w:sz w:val="20"/>
+      </w:rPr>
+    </w:lvl>
+    <w:lvl w:ilvl="8" w:tentative="1">
+      <w:start w:val="1"/>
+      <w:numFmt w:val="bullet"/>
+      <w:lvlText w:val=""/>
+      <w:lvlJc w:val="left"/>
+      <w:pPr>
+        <w:tabs>
+          <w:tab w:val="num" w:pos="6480"/>
+        </w:tabs>
+        <w:ind w:left="6480" w:hanging="360"/>
+      </w:pPr>
+      <w:rPr>
+        <w:rFonts w:ascii="Wingdings" w:hAnsi="Wingdings" w:hint="default"/>
+        <w:sz w:val="20"/>
+      </w:rPr>
+    </w:lvl>
+  </w:abstractNum>
   <w:num w:numId="1">
     <w:abstractNumId w:val="1"/>
   </w:num>
@@ -936,6 +1387,9 @@
   </w:num>
   <w:num w:numId="3">
     <w:abstractNumId w:val="0"/>
+  </w:num>
+  <w:num w:numId="4">
+    <w:abstractNumId w:val="3"/>
   </w:num>
 </w:numbering>
 </file>

</xml_diff>